<commit_message>
docs: add registration method flowchart to academic report
Adds a flowchart of the exact registration pipeline (stable bone mask, centroid initialization, correlation/landmark rigid candidates, bone-Dice QC, best-of selection, fallbacks) with an explanatory caption and step summary.
</commit_message>
<xml_diff>
--- a/RAPOR_AKADEMIK_REGISTRATION_RADIOMICS_v1.0.0.docx
+++ b/RAPOR_AKADEMIK_REGISTRATION_RADIOMICS_v1.0.0.docx
@@ -261,7 +261,57 @@
     </w:p>
     <w:p>
       <w:r>
-        <w:t>Aday dönüşümün kabulünde stabil Dice’ın artması ve centroid displacement, HD95, ASSD değerlerinin tanımlı toleranslarda kalması şart koşuldu. Böylece hedef organ maskeleri registration’ı seçmek için kullanılmadı.</w:t>
+        <w:t>Aday dönüşümün kabulünde stabil Dice'ın artması ve centroid displacement, HD95, ASSD değerlerinin tanımlı toleranslarda kalması şart koşuldu. Böylece hedef organ maskeleri registration'ı seçmek için kullanılmadı.</w:t>
+      </w:r>
+    </w:p>
+    <w:p>
+      <w:r>
+        <w:drawing>
+          <wp:inline xmlns:a="http://schemas.openxmlformats.org/drawingml/2006/main" xmlns:pic="http://schemas.openxmlformats.org/drawingml/2006/picture">
+            <wp:extent cx="5669280" cy="7769013"/>
+            <wp:docPr id="1" name="Picture 1"/>
+            <wp:cNvGraphicFramePr>
+              <a:graphicFrameLocks noChangeAspect="1"/>
+            </wp:cNvGraphicFramePr>
+            <a:graphic>
+              <a:graphicData uri="http://schemas.openxmlformats.org/drawingml/2006/picture">
+                <pic:pic>
+                  <pic:nvPicPr>
+                    <pic:cNvPr id="0" name="method_flowchart.png"/>
+                    <pic:cNvPicPr/>
+                  </pic:nvPicPr>
+                  <pic:blipFill>
+                    <a:blip r:embed="rId9"/>
+                    <a:stretch>
+                      <a:fillRect/>
+                    </a:stretch>
+                  </pic:blipFill>
+                  <pic:spPr>
+                    <a:xfrm>
+                      <a:off x="0" y="0"/>
+                      <a:ext cx="5669280" cy="7769013"/>
+                    </a:xfrm>
+                    <a:prstGeom prst="rect"/>
+                  </pic:spPr>
+                </pic:pic>
+              </a:graphicData>
+            </a:graphic>
+          </wp:inline>
+        </w:drawing>
+      </w:r>
+    </w:p>
+    <w:p>
+      <w:pPr>
+        <w:pStyle w:val="Caption"/>
+        <w:jc w:val="center"/>
+      </w:pPr>
+      <w:r>
+        <w:t>Şekil. Registration yöntem akışı: stabil kemik maskesi, centroid ötelemesi (başlangıç), correlation/landmark rigid adayları, kemik-Dice QC ve en iyi aday seçimi.</w:t>
+      </w:r>
+    </w:p>
+    <w:p>
+      <w:r>
+        <w:t>Akış özeti: (1) stabil kemik maskesi çıkarılır; (2) organ centroid farkı eşiğin altındaysa identity; (3) aksi halde kemik centroid ötelemesi başlangıç alınır; (4) correlation rigid ve landmark rigid (Kabsch/SVD) adayları üretilir; (5) her aday kemik Dice ve centroid/HD95/ASSD toleransıyla QC edilir; (6) geçen adaylar arasından en yüksek kemik Dice'lısı seçilir; (7) hiçbiri geçmezse centroid öteleme, o da geçmezse identity uygulanır.</w:t>
       </w:r>
     </w:p>
     <w:p>
@@ -768,7 +818,7 @@
         <w:drawing>
           <wp:inline xmlns:a="http://schemas.openxmlformats.org/drawingml/2006/main" xmlns:pic="http://schemas.openxmlformats.org/drawingml/2006/picture">
             <wp:extent cx="5852160" cy="3277210"/>
-            <wp:docPr id="1" name="Picture 1"/>
+            <wp:docPr id="2" name="Picture 2"/>
             <wp:cNvGraphicFramePr>
               <a:graphicFrameLocks noChangeAspect="1"/>
             </wp:cNvGraphicFramePr>
@@ -780,7 +830,7 @@
                     <pic:cNvPicPr/>
                   </pic:nvPicPr>
                   <pic:blipFill>
-                    <a:blip r:embed="rId9"/>
+                    <a:blip r:embed="rId10"/>
                     <a:stretch>
                       <a:fillRect/>
                     </a:stretch>
@@ -813,7 +863,7 @@
         <w:drawing>
           <wp:inline xmlns:a="http://schemas.openxmlformats.org/drawingml/2006/main" xmlns:pic="http://schemas.openxmlformats.org/drawingml/2006/picture">
             <wp:extent cx="5852160" cy="3277210"/>
-            <wp:docPr id="2" name="Picture 2"/>
+            <wp:docPr id="3" name="Picture 3"/>
             <wp:cNvGraphicFramePr>
               <a:graphicFrameLocks noChangeAspect="1"/>
             </wp:cNvGraphicFramePr>
@@ -825,7 +875,7 @@
                     <pic:cNvPicPr/>
                   </pic:nvPicPr>
                   <pic:blipFill>
-                    <a:blip r:embed="rId10"/>
+                    <a:blip r:embed="rId11"/>
                     <a:stretch>
                       <a:fillRect/>
                     </a:stretch>
@@ -1518,7 +1568,7 @@
         <w:drawing>
           <wp:inline xmlns:a="http://schemas.openxmlformats.org/drawingml/2006/main" xmlns:pic="http://schemas.openxmlformats.org/drawingml/2006/picture">
             <wp:extent cx="5852160" cy="3140184"/>
-            <wp:docPr id="3" name="Picture 3"/>
+            <wp:docPr id="4" name="Picture 4"/>
             <wp:cNvGraphicFramePr>
               <a:graphicFrameLocks noChangeAspect="1"/>
             </wp:cNvGraphicFramePr>
@@ -1530,7 +1580,7 @@
                     <pic:cNvPicPr/>
                   </pic:nvPicPr>
                   <pic:blipFill>
-                    <a:blip r:embed="rId11"/>
+                    <a:blip r:embed="rId12"/>
                     <a:stretch>
                       <a:fillRect/>
                     </a:stretch>
@@ -1674,7 +1724,7 @@
         <w:drawing>
           <wp:inline xmlns:a="http://schemas.openxmlformats.org/drawingml/2006/main" xmlns:pic="http://schemas.openxmlformats.org/drawingml/2006/picture">
             <wp:extent cx="5852160" cy="3601329"/>
-            <wp:docPr id="4" name="Picture 4"/>
+            <wp:docPr id="5" name="Picture 5"/>
             <wp:cNvGraphicFramePr>
               <a:graphicFrameLocks noChangeAspect="1"/>
             </wp:cNvGraphicFramePr>
@@ -1686,7 +1736,7 @@
                     <pic:cNvPicPr/>
                   </pic:nvPicPr>
                   <pic:blipFill>
-                    <a:blip r:embed="rId12"/>
+                    <a:blip r:embed="rId13"/>
                     <a:stretch>
                       <a:fillRect/>
                     </a:stretch>
@@ -4289,7 +4339,7 @@
         <w:drawing>
           <wp:inline xmlns:a="http://schemas.openxmlformats.org/drawingml/2006/main" xmlns:pic="http://schemas.openxmlformats.org/drawingml/2006/picture">
             <wp:extent cx="5943600" cy="2377440"/>
-            <wp:docPr id="5" name="Picture 5"/>
+            <wp:docPr id="6" name="Picture 6"/>
             <wp:cNvGraphicFramePr>
               <a:graphicFrameLocks noChangeAspect="1"/>
             </wp:cNvGraphicFramePr>
@@ -4301,7 +4351,7 @@
                     <pic:cNvPicPr/>
                   </pic:nvPicPr>
                   <pic:blipFill>
-                    <a:blip r:embed="rId13"/>
+                    <a:blip r:embed="rId14"/>
                     <a:stretch>
                       <a:fillRect/>
                     </a:stretch>

</xml_diff>